<commit_message>
Payload orders: in-kind payment path (Jon 10/11) — value = standard price, single $1 INK documentation invoice replaces M1-M3, human records goods received; qb_invoice INK support; Rev5 draft updated
</commit_message>
<xml_diff>
--- a/drafts/procedures/EXOS_Aerospace_Payload_Process_Manual_-_v1.1_-_Rev5_DRAFT_2026-10-11.docx
+++ b/drafts/procedures/EXOS_Aerospace_Payload_Process_Manual_-_v1.1_-_Rev5_DRAFT_2026-10-11.docx
@@ -1026,6 +1026,13 @@
         </w:rPr>
         <w:t>The agreement is sent and signed through ExoSign in Mission Control by default: the client signs first, then EXOS (John Quinn) countersigns, and the executed copy is filed on the order automatically. An agreement may be signed outside Mission Control only by exception (for example, if ExoSign is unavailable). The person recording it must enter the execution date, where the fully signed copy is filed, and why ExoSign was not used.</w:t>
       </w:r>
+      <w:r>
+        <w:rPr>
+          <w:rFonts w:ascii="arial;sans-serif" w:hAnsi="arial;sans-serif"/>
+          <w:highlight w:val="yellow"/>
+        </w:rPr>
+        <w:t xml:space="preserve"> In-kind payment: if a client pays with goods or services instead of cash, the in-kind value is set equal to the standard price (the per-kg flight price plus the $500 integration fee; for example, $7,500 + $500 = $8,000). A single $1.00 documentation invoice replaces the cash milestones (M1/M2/M3), so every payload follows the same invoicing and tracking path. The order is complete when the $1.00 is paid and an EXOS team member records in Mission Control that the in-kind consideration was received.</w:t>
+      </w:r>
     </w:p>
     <w:p>
       <w:pPr>
@@ -1598,7 +1605,7 @@
         <w:rPr>
           <w:highlight w:val="yellow"/>
         </w:rPr>
-        <w:t>Rev5 — 2026-10-11 — DRAFT for approval: Step #3 makes ExoSign the default signing path for the Launch and Payload Integration Services Agreement, and an outside signature requires the date, where the copy is filed, and the reason. Step #5 adds the human confirmation that the wet-signed waiver original is on file, prompted by a Mission Control Decision.</w:t>
+        <w:t>Rev5 — 2026-10-11 — DRAFT for approval: Step #3 makes ExoSign the default signing path for the Launch and Payload Integration Services Agreement, and an outside signature requires the date, where the copy is filed, and the reason. Step #5 adds the human confirmation that the wet-signed waiver original is on file, prompted by a Mission Control Decision; Step #3 also adds the in-kind payment path (value equal to the standard price, documented by a $1.00 invoice).</w:t>
       </w:r>
     </w:p>
     <w:p>

</xml_diff>